<commit_message>
Efeitos sonoros livres, créditos e correções da Mesa de Cena
40 efeitos do freesound.org (CC0 e CC BY) cortados, nivelados e
convertidos para OGG, com autores e licenças em CREDITOS.txt.
Mesa em três colunas para caber em telas de 1366x768; ENTER antes do
fim de uma sequência conclui as mudanças pendentes da deixa anterior;
raios sincronizados com a música do ciclone voltam a disparar.

Co-Authored-By: Claude Opus 5.5 <noreply@anthropic.com>
Claude-Session: https://claude.ai/code/session_01BrHTQFpwq35p21m7k8Mujw
</commit_message>
<xml_diff>
--- a/Roteiro do Operador.docx
+++ b/Roteiro do Operador.docx
@@ -831,7 +831,7 @@
               <w:rPr>
                 <w:sz w:val="19"/>
               </w:rPr>
-              <w:t>rugido do tornado; casa caindo (estrondo); ♪ música sai; sons de fundo saem</w:t>
+              <w:t>rugido do tornado; casa caindo (estrondo); impacto; ♪ música sai; sons de fundo saem</w:t>
             </w:r>
             <w:r>
               <w:br/>
@@ -1701,7 +1701,7 @@
               <w:rPr>
                 <w:sz w:val="19"/>
               </w:rPr>
-              <w:t>palha mexendo; tombo; corvos</w:t>
+              <w:t>palha mexendo; tombo; corvos voando</w:t>
             </w:r>
             <w:r>
               <w:br/>

</xml_diff>

<commit_message>
Mesa de Cena pronta: programa para Windows, imagens extras e 46 deixas
- Mesa de Cena - O Magico de Oz.exe (portátil, Windows 10/11): mesa do
  operador no notebook e projeção em tela cheia no projetor; ENTER
  dispara cada deixa, Backspace desfaz, Esc silencia, B tela preta.
- Imagens livres: céu de tempestade, tornado e raios (NOAA, domínio
  público), sapatos de rubi recortados (CC BY 2.0) e ilustrações
  originais de W. W. Denslow (1900) nos agradecimentos.
- Deixas novas: céu da tempestade no aviso do ciclone e o tornado antes
  do vídeo da casa; créditos e roteiro do operador atualizados.

Co-Authored-By: Claude Opus 5.5 <noreply@anthropic.com>
Claude-Session: https://claude.ai/code/session_01BrHTQFpwq35p21m7k8Mujw
</commit_message>
<xml_diff>
--- a/Roteiro do Operador.docx
+++ b/Roteiro do Operador.docx
@@ -532,7 +532,7 @@
         <w:rPr>
           <w:sz w:val="19"/>
         </w:rPr>
-        <w:t>TIO HENRY: "Vem aí um ciclone, Ema!" (aperte quando ele começar a falar).</w:t>
+        <w:t>TIO HENRY: "Vem aí um ciclone, Ema!" (aperte quando ele começar a falar). Aparece o céu da tempestade sobre a fazenda.</w:t>
       </w:r>
       <w:r>
         <w:br/>
@@ -549,7 +549,7 @@
         <w:rPr>
           <w:sz w:val="19"/>
         </w:rPr>
-        <w:t>muda a luz da imagem</w:t>
+        <w:t>imagens/ceu_tempestade (aparece devagar)</w:t>
       </w:r>
       <w:r>
         <w:br/>
@@ -583,7 +583,7 @@
         <w:rPr>
           <w:sz w:val="19"/>
         </w:rPr>
-        <w:t>vento com folhas e palha</w:t>
+        <w:t>clarão; vento com folhas e palha</w:t>
       </w:r>
     </w:p>
     <w:p>
@@ -710,7 +710,7 @@
               <w:rPr>
                 <w:sz w:val="19"/>
               </w:rPr>
-              <w:t>muda a luz da imagem</w:t>
+              <w:t>Casa (aparece devagar)</w:t>
             </w:r>
             <w:r>
               <w:br/>
@@ -780,7 +780,7 @@
                 <w:b/>
                 <w:sz w:val="23"/>
               </w:rPr>
-              <w:t>A casa voa (vídeo)</w:t>
+              <w:t>O tornado gira</w:t>
             </w:r>
             <w:r>
               <w:br/>
@@ -797,7 +797,7 @@
               <w:rPr>
                 <w:sz w:val="19"/>
               </w:rPr>
-              <w:t>Quando a casa "levantar voo". O vídeo dura 15 s e termina com a casa caindo.</w:t>
+              <w:t>Quando a casa começar a "girar" (atores se segurando, cambaleando).</w:t>
             </w:r>
             <w:r>
               <w:br/>
@@ -814,7 +814,7 @@
               <w:rPr>
                 <w:sz w:val="19"/>
               </w:rPr>
-              <w:t>vídeo da casa voando; tela preta</w:t>
+              <w:t>imagens/tornado (girando)</w:t>
             </w:r>
             <w:r>
               <w:br/>
@@ -831,7 +831,7 @@
               <w:rPr>
                 <w:sz w:val="19"/>
               </w:rPr>
-              <w:t>rugido do tornado; casa caindo (estrondo); impacto; ♪ música sai; sons de fundo saem</w:t>
+              <w:t>rugido do tornado</w:t>
             </w:r>
             <w:r>
               <w:br/>
@@ -848,7 +848,7 @@
               <w:rPr>
                 <w:sz w:val="19"/>
               </w:rPr>
-              <w:t>redemoinho; chuva; clarão; tela treme</w:t>
+              <w:t>chuva; vento com folhas e palha; redemoinho; raios e trovões; tela treme</w:t>
             </w:r>
           </w:p>
         </w:tc>
@@ -884,7 +884,7 @@
                 <w:b/>
                 <w:sz w:val="23"/>
               </w:rPr>
-              <w:t>Terra de Oz — em cores!</w:t>
+              <w:t>A casa voa (vídeo)</w:t>
             </w:r>
             <w:r>
               <w:br/>
@@ -901,7 +901,7 @@
               <w:rPr>
                 <w:sz w:val="19"/>
               </w:rPr>
-              <w:t>Depois de alguns segundos de silêncio no escuro: quando Dorothy abrir a porta da casa.</w:t>
+              <w:t>Quando a casa "levantar voo". O vídeo dura 15 s e termina com a casa caindo.</w:t>
             </w:r>
             <w:r>
               <w:br/>
@@ -918,7 +918,7 @@
               <w:rPr>
                 <w:sz w:val="19"/>
               </w:rPr>
-              <w:t>Vila (troca na hora); a imagem volta</w:t>
+              <w:t>vídeo da casa voando; tela preta</w:t>
             </w:r>
             <w:r>
               <w:br/>
@@ -935,7 +935,7 @@
               <w:rPr>
                 <w:sz w:val="19"/>
               </w:rPr>
-              <w:t>brilho mágico; passarinhos (contínuo)</w:t>
+              <w:t>rugido do tornado; casa caindo (estrondo); impacto; ♪ música sai; sons de fundo saem</w:t>
             </w:r>
             <w:r>
               <w:br/>
@@ -952,7 +952,7 @@
               <w:rPr>
                 <w:sz w:val="19"/>
               </w:rPr>
-              <w:t>brilhos; raios de luz</w:t>
+              <w:t>redemoinho; chuva; clarão; tela treme</w:t>
             </w:r>
           </w:p>
         </w:tc>
@@ -988,6 +988,110 @@
                 <w:b/>
                 <w:sz w:val="23"/>
               </w:rPr>
+              <w:t>Terra de Oz — em cores!</w:t>
+            </w:r>
+            <w:r>
+              <w:br/>
+            </w:r>
+            <w:r>
+              <w:rPr>
+                <w:b/>
+                <w:color w:val="555555"/>
+                <w:sz w:val="19"/>
+              </w:rPr>
+              <w:t xml:space="preserve">Quando: </w:t>
+            </w:r>
+            <w:r>
+              <w:rPr>
+                <w:sz w:val="19"/>
+              </w:rPr>
+              <w:t>Depois de alguns segundos de silêncio no escuro: quando Dorothy abrir a porta da casa.</w:t>
+            </w:r>
+            <w:r>
+              <w:br/>
+            </w:r>
+            <w:r>
+              <w:rPr>
+                <w:b/>
+                <w:color w:val="555555"/>
+                <w:sz w:val="19"/>
+              </w:rPr>
+              <w:t xml:space="preserve">Imagem: </w:t>
+            </w:r>
+            <w:r>
+              <w:rPr>
+                <w:sz w:val="19"/>
+              </w:rPr>
+              <w:t>Vila (troca na hora); a imagem volta</w:t>
+            </w:r>
+            <w:r>
+              <w:br/>
+            </w:r>
+            <w:r>
+              <w:rPr>
+                <w:b/>
+                <w:color w:val="555555"/>
+                <w:sz w:val="19"/>
+              </w:rPr>
+              <w:t xml:space="preserve">Som: </w:t>
+            </w:r>
+            <w:r>
+              <w:rPr>
+                <w:sz w:val="19"/>
+              </w:rPr>
+              <w:t>brilho mágico; passarinhos (contínuo)</w:t>
+            </w:r>
+            <w:r>
+              <w:br/>
+            </w:r>
+            <w:r>
+              <w:rPr>
+                <w:b/>
+                <w:color w:val="555555"/>
+                <w:sz w:val="19"/>
+              </w:rPr>
+              <w:t xml:space="preserve">Efeitos: </w:t>
+            </w:r>
+            <w:r>
+              <w:rPr>
+                <w:sz w:val="19"/>
+              </w:rPr>
+              <w:t>brilhos; raios de luz</w:t>
+            </w:r>
+          </w:p>
+        </w:tc>
+      </w:tr>
+      <w:tr>
+        <w:tc>
+          <w:tcPr>
+            <w:tcW w:type="dxa" w:w="9500"/>
+            <w:tcBorders>
+              <w:top w:val="none"/>
+              <w:left w:val="none"/>
+              <w:bottom w:val="single" w:color="9E9E9E" w:sz="4"/>
+              <w:right w:val="none"/>
+            </w:tcBorders>
+            <w:tcMar>
+              <w:top w:type="dxa" w:w="60"/>
+              <w:left w:type="dxa" w:w="0"/>
+              <w:bottom w:type="dxa" w:w="60"/>
+              <w:right w:type="dxa" w:w="0"/>
+            </w:tcMar>
+          </w:tcPr>
+          <w:p>
+            <w:r>
+              <w:rPr>
+                <w:b/>
+                <w:color w:val="B01E1E"/>
+                <w:sz w:val="23"/>
+              </w:rPr>
+              <w:t xml:space="preserve">▶ ENTER 8  </w:t>
+            </w:r>
+            <w:r>
+              <w:rPr>
+                <w:b/>
+                <w:sz w:val="23"/>
+              </w:rPr>
               <w:t>Chega a Fada do Norte</w:t>
             </w:r>
             <w:r>
@@ -1108,7 +1212,7 @@
           <w:color w:val="B01E1E"/>
           <w:sz w:val="23"/>
         </w:rPr>
-        <w:t xml:space="preserve">▶ ENTER 8  </w:t>
+        <w:t xml:space="preserve">▶ ENTER 9  </w:t>
       </w:r>
       <w:r>
         <w:rPr>
@@ -1133,6 +1237,23 @@
           <w:sz w:val="19"/>
         </w:rPr>
         <w:t>FADA DO NORTE: "...Esses sapatos de rubi agora são seus" (aperte em "sapatos de rubi").</w:t>
+      </w:r>
+      <w:r>
+        <w:br/>
+      </w:r>
+      <w:r>
+        <w:rPr>
+          <w:b/>
+          <w:color w:val="555555"/>
+          <w:sz w:val="19"/>
+        </w:rPr>
+        <w:t xml:space="preserve">Imagem: </w:t>
+      </w:r>
+      <w:r>
+        <w:rPr>
+          <w:sz w:val="19"/>
+        </w:rPr>
+        <w:t>muda a luz da imagem</w:t>
       </w:r>
       <w:r>
         <w:br/>
@@ -1249,7 +1370,7 @@
           <w:color w:val="B01E1E"/>
           <w:sz w:val="23"/>
         </w:rPr>
-        <w:t xml:space="preserve">▶ ENTER 9  </w:t>
+        <w:t xml:space="preserve">▶ ENTER 10  </w:t>
       </w:r>
       <w:r>
         <w:rPr>
@@ -1381,7 +1502,7 @@
                 <w:color w:val="B01E1E"/>
                 <w:sz w:val="23"/>
               </w:rPr>
-              <w:t xml:space="preserve">▶ ENTER 10  </w:t>
+              <w:t xml:space="preserve">▶ ENTER 11  </w:t>
             </w:r>
             <w:r>
               <w:rPr>
@@ -1485,7 +1606,7 @@
                 <w:color w:val="B01E1E"/>
                 <w:sz w:val="23"/>
               </w:rPr>
-              <w:t xml:space="preserve">▶ ENTER 11  </w:t>
+              <w:t xml:space="preserve">▶ ENTER 12  </w:t>
             </w:r>
             <w:r>
               <w:rPr>
@@ -1660,7 +1781,7 @@
                 <w:color w:val="B01E1E"/>
                 <w:sz w:val="23"/>
               </w:rPr>
-              <w:t xml:space="preserve">▶ ENTER 12  </w:t>
+              <w:t xml:space="preserve">▶ ENTER 13  </w:t>
             </w:r>
             <w:r>
               <w:rPr>
@@ -1913,7 +2034,7 @@
           <w:color w:val="B01E1E"/>
           <w:sz w:val="23"/>
         </w:rPr>
-        <w:t xml:space="preserve">▶ ENTER 13  </w:t>
+        <w:t xml:space="preserve">▶ ENTER 14  </w:t>
       </w:r>
       <w:r>
         <w:rPr>
@@ -2028,7 +2149,7 @@
                 <w:color w:val="B01E1E"/>
                 <w:sz w:val="23"/>
               </w:rPr>
-              <w:t xml:space="preserve">▶ ENTER 14  </w:t>
+              <w:t xml:space="preserve">▶ ENTER 15  </w:t>
             </w:r>
             <w:r>
               <w:rPr>
@@ -2132,7 +2253,7 @@
                 <w:color w:val="B01E1E"/>
                 <w:sz w:val="23"/>
               </w:rPr>
-              <w:t xml:space="preserve">▶ ENTER 15  </w:t>
+              <w:t xml:space="preserve">▶ ENTER 16  </w:t>
             </w:r>
             <w:r>
               <w:rPr>
@@ -2307,7 +2428,7 @@
                 <w:color w:val="B01E1E"/>
                 <w:sz w:val="23"/>
               </w:rPr>
-              <w:t xml:space="preserve">▶ ENTER 16  </w:t>
+              <w:t xml:space="preserve">▶ ENTER 17  </w:t>
             </w:r>
             <w:r>
               <w:rPr>
@@ -2560,7 +2681,7 @@
           <w:color w:val="B01E1E"/>
           <w:sz w:val="23"/>
         </w:rPr>
-        <w:t xml:space="preserve">▶ ENTER 17  </w:t>
+        <w:t xml:space="preserve">▶ ENTER 18  </w:t>
       </w:r>
       <w:r>
         <w:rPr>
@@ -2658,7 +2779,7 @@
                 <w:color w:val="B01E1E"/>
                 <w:sz w:val="23"/>
               </w:rPr>
-              <w:t xml:space="preserve">▶ ENTER 18  </w:t>
+              <w:t xml:space="preserve">▶ ENTER 19  </w:t>
             </w:r>
             <w:r>
               <w:rPr>
@@ -2762,7 +2883,7 @@
                 <w:color w:val="B01E1E"/>
                 <w:sz w:val="23"/>
               </w:rPr>
-              <w:t xml:space="preserve">▶ ENTER 19  </w:t>
+              <w:t xml:space="preserve">▶ ENTER 20  </w:t>
             </w:r>
             <w:r>
               <w:rPr>
@@ -2995,7 +3116,7 @@
           <w:color w:val="B01E1E"/>
           <w:sz w:val="23"/>
         </w:rPr>
-        <w:t xml:space="preserve">▶ ENTER 20  </w:t>
+        <w:t xml:space="preserve">▶ ENTER 21  </w:t>
       </w:r>
       <w:r>
         <w:rPr>
@@ -3110,7 +3231,7 @@
                 <w:color w:val="B01E1E"/>
                 <w:sz w:val="23"/>
               </w:rPr>
-              <w:t xml:space="preserve">▶ ENTER 21  </w:t>
+              <w:t xml:space="preserve">▶ ENTER 22  </w:t>
             </w:r>
             <w:r>
               <w:rPr>
@@ -3214,7 +3335,7 @@
                 <w:color w:val="B01E1E"/>
                 <w:sz w:val="23"/>
               </w:rPr>
-              <w:t xml:space="preserve">▶ ENTER 22  </w:t>
+              <w:t xml:space="preserve">▶ ENTER 23  </w:t>
             </w:r>
             <w:r>
               <w:rPr>
@@ -3318,7 +3439,7 @@
                 <w:color w:val="B01E1E"/>
                 <w:sz w:val="23"/>
               </w:rPr>
-              <w:t xml:space="preserve">▶ ENTER 23  </w:t>
+              <w:t xml:space="preserve">▶ ENTER 24  </w:t>
             </w:r>
             <w:r>
               <w:rPr>
@@ -3553,7 +3674,7 @@
           <w:color w:val="B01E1E"/>
           <w:sz w:val="23"/>
         </w:rPr>
-        <w:t xml:space="preserve">▶ ENTER 24  </w:t>
+        <w:t xml:space="preserve">▶ ENTER 25  </w:t>
       </w:r>
       <w:r>
         <w:rPr>
@@ -3668,7 +3789,7 @@
                 <w:color w:val="B01E1E"/>
                 <w:sz w:val="23"/>
               </w:rPr>
-              <w:t xml:space="preserve">▶ ENTER 25  </w:t>
+              <w:t xml:space="preserve">▶ ENTER 26  </w:t>
             </w:r>
             <w:r>
               <w:rPr>
@@ -3772,7 +3893,7 @@
                 <w:color w:val="B01E1E"/>
                 <w:sz w:val="23"/>
               </w:rPr>
-              <w:t xml:space="preserve">▶ ENTER 26  </w:t>
+              <w:t xml:space="preserve">▶ ENTER 27  </w:t>
             </w:r>
             <w:r>
               <w:rPr>
@@ -4027,7 +4148,7 @@
           <w:color w:val="B01E1E"/>
           <w:sz w:val="23"/>
         </w:rPr>
-        <w:t xml:space="preserve">▶ ENTER 27  </w:t>
+        <w:t xml:space="preserve">▶ ENTER 28  </w:t>
       </w:r>
       <w:r>
         <w:rPr>
@@ -4124,7 +4245,7 @@
           <w:color w:val="B01E1E"/>
           <w:sz w:val="23"/>
         </w:rPr>
-        <w:t xml:space="preserve">▶ ENTER 28  </w:t>
+        <w:t xml:space="preserve">▶ ENTER 29  </w:t>
       </w:r>
       <w:r>
         <w:rPr>
@@ -4262,7 +4383,7 @@
                 <w:color w:val="B01E1E"/>
                 <w:sz w:val="23"/>
               </w:rPr>
-              <w:t xml:space="preserve">▶ ENTER 29  </w:t>
+              <w:t xml:space="preserve">▶ ENTER 30  </w:t>
             </w:r>
             <w:r>
               <w:rPr>
@@ -4444,7 +4565,7 @@
           <w:color w:val="B01E1E"/>
           <w:sz w:val="23"/>
         </w:rPr>
-        <w:t xml:space="preserve">▶ ENTER 30  </w:t>
+        <w:t xml:space="preserve">▶ ENTER 31  </w:t>
       </w:r>
       <w:r>
         <w:rPr>
@@ -4559,7 +4680,7 @@
                 <w:color w:val="B01E1E"/>
                 <w:sz w:val="23"/>
               </w:rPr>
-              <w:t xml:space="preserve">▶ ENTER 31  </w:t>
+              <w:t xml:space="preserve">▶ ENTER 32  </w:t>
             </w:r>
             <w:r>
               <w:rPr>
@@ -4854,7 +4975,7 @@
                 <w:color w:val="B01E1E"/>
                 <w:sz w:val="23"/>
               </w:rPr>
-              <w:t xml:space="preserve">▶ ENTER 32  </w:t>
+              <w:t xml:space="preserve">▶ ENTER 33  </w:t>
             </w:r>
             <w:r>
               <w:rPr>
@@ -4941,7 +5062,7 @@
                 <w:color w:val="B01E1E"/>
                 <w:sz w:val="23"/>
               </w:rPr>
-              <w:t xml:space="preserve">▶ ENTER 33  </w:t>
+              <w:t xml:space="preserve">▶ ENTER 34  </w:t>
             </w:r>
             <w:r>
               <w:rPr>
@@ -5194,7 +5315,7 @@
                 <w:color w:val="B01E1E"/>
                 <w:sz w:val="23"/>
               </w:rPr>
-              <w:t xml:space="preserve">▶ ENTER 34  </w:t>
+              <w:t xml:space="preserve">▶ ENTER 35  </w:t>
             </w:r>
             <w:r>
               <w:rPr>
@@ -5359,7 +5480,7 @@
           <w:color w:val="B01E1E"/>
           <w:sz w:val="23"/>
         </w:rPr>
-        <w:t xml:space="preserve">▶ ENTER 35  </w:t>
+        <w:t xml:space="preserve">▶ ENTER 36  </w:t>
       </w:r>
       <w:r>
         <w:rPr>
@@ -5456,7 +5577,7 @@
           <w:color w:val="B01E1E"/>
           <w:sz w:val="23"/>
         </w:rPr>
-        <w:t xml:space="preserve">▶ ENTER 36  </w:t>
+        <w:t xml:space="preserve">▶ ENTER 37  </w:t>
       </w:r>
       <w:r>
         <w:rPr>
@@ -5597,7 +5718,7 @@
           <w:color w:val="B01E1E"/>
           <w:sz w:val="23"/>
         </w:rPr>
-        <w:t xml:space="preserve">▶ ENTER 37  </w:t>
+        <w:t xml:space="preserve">▶ ENTER 38  </w:t>
       </w:r>
       <w:r>
         <w:rPr>
@@ -5695,7 +5816,7 @@
                 <w:color w:val="B01E1E"/>
                 <w:sz w:val="23"/>
               </w:rPr>
-              <w:t xml:space="preserve">▶ ENTER 38  </w:t>
+              <w:t xml:space="preserve">▶ ENTER 39  </w:t>
             </w:r>
             <w:r>
               <w:rPr>
@@ -5799,7 +5920,7 @@
                 <w:color w:val="B01E1E"/>
                 <w:sz w:val="23"/>
               </w:rPr>
-              <w:t xml:space="preserve">▶ ENTER 39  </w:t>
+              <w:t xml:space="preserve">▶ ENTER 40  </w:t>
             </w:r>
             <w:r>
               <w:rPr>
@@ -5993,7 +6114,7 @@
           <w:color w:val="B01E1E"/>
           <w:sz w:val="23"/>
         </w:rPr>
-        <w:t xml:space="preserve">▶ ENTER 40  </w:t>
+        <w:t xml:space="preserve">▶ ENTER 41  </w:t>
       </w:r>
       <w:r>
         <w:rPr>
@@ -6285,7 +6406,7 @@
                 <w:color w:val="B01E1E"/>
                 <w:sz w:val="23"/>
               </w:rPr>
-              <w:t xml:space="preserve">▶ ENTER 41  </w:t>
+              <w:t xml:space="preserve">▶ ENTER 42  </w:t>
             </w:r>
             <w:r>
               <w:rPr>
@@ -6485,7 +6606,7 @@
                 <w:color w:val="B01E1E"/>
                 <w:sz w:val="23"/>
               </w:rPr>
-              <w:t xml:space="preserve">▶ ENTER 42  </w:t>
+              <w:t xml:space="preserve">▶ ENTER 43  </w:t>
             </w:r>
             <w:r>
               <w:rPr>
@@ -6887,7 +7008,7 @@
           <w:color w:val="B01E1E"/>
           <w:sz w:val="23"/>
         </w:rPr>
-        <w:t xml:space="preserve">▶ ENTER 43  </w:t>
+        <w:t xml:space="preserve">▶ ENTER 44  </w:t>
       </w:r>
       <w:r>
         <w:rPr>
@@ -6979,7 +7100,7 @@
           <w:color w:val="B01E1E"/>
           <w:sz w:val="23"/>
         </w:rPr>
-        <w:t xml:space="preserve">▶ ENTER 44  </w:t>
+        <w:t xml:space="preserve">▶ ENTER 45  </w:t>
       </w:r>
       <w:r>
         <w:rPr>
@@ -7003,7 +7124,7 @@
         <w:rPr>
           <w:sz w:val="19"/>
         </w:rPr>
-        <w:t>Quando os atores voltarem para agradecer.</w:t>
+        <w:t>Quando os atores voltarem para agradecer. Depois do "Obrigado!" passam as ilustrações do livro original de 1900.</w:t>
       </w:r>
       <w:r>
         <w:br/>
@@ -7020,7 +7141,7 @@
         <w:rPr>
           <w:sz w:val="19"/>
         </w:rPr>
-        <w:t>Esmeralda (com brilho mágico); título “Obrigado!”</w:t>
+        <w:t>Esmeralda (com brilho mágico); título “Obrigado!”; imagem extra: denslow titulo; imagem extra: denslow scarecrow; imagem extra: denslow trio; imagem extra: denslow cowardly lion; imagem extra: denslow wizard head; imagem extra: denslow glinda; imagem extra: denslow cover</w:t>
       </w:r>
       <w:r>
         <w:br/>
@@ -7071,7 +7192,7 @@
           <w:color w:val="B01E1E"/>
           <w:sz w:val="23"/>
         </w:rPr>
-        <w:t xml:space="preserve">▶ ENTER 45  </w:t>
+        <w:t xml:space="preserve">▶ ENTER 46  </w:t>
       </w:r>
       <w:r>
         <w:rPr>

</xml_diff>